<commit_message>
SOP: correct audit-rule wildcard (* not %), add noise+wildcard troubleshooting
Co-Authored-By: Claude Opus 4.8 <noreply@anthropic.com>
</commit_message>
<xml_diff>
--- a/dev/dam/docs/TooVix-DAM-SOP-Agentless-Cloud-SQL-PubSub.docx
+++ b/dev/dam/docs/TooVix-DAM-SOP-Agentless-Cloud-SQL-PubSub.docx
@@ -2194,7 +2194,7 @@
                 <w:szCs w:val="16"/>
                 <w:rFonts w:ascii="Consolas" w:cs="Consolas" w:eastAsia="Consolas" w:hAnsi="Consolas"/>
               </w:rPr>
-              <w:t xml:space="preserve">CALL mysql.cloudsql_create_audit_rule('`%`@`%`', '`%`', '`%`', 'connect,dql,dml,ddl,dcl', 'B', 1, @rc, @msg);</w:t>
+              <w:t xml:space="preserve">CALL mysql.cloudsql_create_audit_rule('*', '*', '*', '*', 'B', 1, @rc, @msg);</w:t>
             </w:r>
           </w:p>
           <w:p>
@@ -2207,7 +2207,20 @@
                 <w:szCs w:val="16"/>
                 <w:rFonts w:ascii="Consolas" w:cs="Consolas" w:eastAsia="Consolas" w:hAnsi="Consolas"/>
               </w:rPr>
-              <w:t xml:space="preserve">SELECT @rc, @msg;   -- 0 / NULL = success</w:t>
+              <w:t xml:space="preserve">SELECT @rc, @msg;                         -- 0 / NULL = success</w:t>
+            </w:r>
+          </w:p>
+          <w:p>
+            <w:pPr>
+              <w:spacing w:after="0" w:line="240"/>
+            </w:pPr>
+            <w:r>
+              <w:rPr>
+                <w:sz w:val="16"/>
+                <w:szCs w:val="16"/>
+                <w:rFonts w:ascii="Consolas" w:cs="Consolas" w:eastAsia="Consolas" w:hAnsi="Consolas"/>
+              </w:rPr>
+              <w:t xml:space="preserve">CALL mysql.cloudsql_reload_audit_rule(1); -- activate the rule (reload_mode arg is required)</w:t>
             </w:r>
           </w:p>
         </w:tc>
@@ -2223,71 +2236,57 @@
         <w:spacing w:after="80"/>
       </w:pPr>
       <w:r>
-        <w:t xml:space="preserve">Gotchas: </w:t>
-      </w:r>
-      <w:r>
-        <w:rPr>
-          <w:b/>
-          <w:bCs/>
-        </w:rPr>
-        <w:t xml:space="preserve">8 arguments</w:t>
-      </w:r>
-      <w:r>
-        <w:t xml:space="preserve">; wildcards </w:t>
-      </w:r>
-      <w:r>
-        <w:rPr>
-          <w:b/>
-          <w:bCs/>
-        </w:rPr>
-        <w:t xml:space="preserve">backtick-quoted</w:t>
-      </w:r>
-      <w:r>
-        <w:t xml:space="preserve"> (`</w:t>
+        <w:t xml:space="preserve">Params: </w:t>
       </w:r>
       <w:r>
         <w:rPr>
           <w:rFonts w:ascii="Consolas" w:cs="Consolas" w:eastAsia="Consolas" w:hAnsi="Consolas"/>
           <w:shd w:fill="F3F5F8" w:val="clear"/>
         </w:rPr>
-        <w:t xml:space="preserve"> </w:t>
-      </w:r>
-      <w:r>
-        <w:t xml:space="preserve">%</w:t>
+        <w:t xml:space="preserve">(user, db, object, ops, op_result, reload_mode, @out, @out)</w:t>
+      </w:r>
+      <w:r>
+        <w:t xml:space="preserve">. **⚠ The wildcard is </w:t>
       </w:r>
       <w:r>
         <w:rPr>
           <w:rFonts w:ascii="Consolas" w:cs="Consolas" w:eastAsia="Consolas" w:hAnsi="Consolas"/>
           <w:shd w:fill="F3F5F8" w:val="clear"/>
         </w:rPr>
-        <w:t xml:space="preserve">@</w:t>
-      </w:r>
-      <w:r>
-        <w:t xml:space="preserve">%</w:t>
+        <w:t xml:space="preserve">*</w:t>
+      </w:r>
+      <w:r>
+        <w:t xml:space="preserve"> (asterisk), NOT </w:t>
       </w:r>
       <w:r>
         <w:rPr>
           <w:rFonts w:ascii="Consolas" w:cs="Consolas" w:eastAsia="Consolas" w:hAnsi="Consolas"/>
           <w:shd w:fill="F3F5F8" w:val="clear"/>
         </w:rPr>
-        <w:t xml:space="preserve"> </w:t>
+        <w:t xml:space="preserve">%</w:t>
+      </w:r>
+      <w:r>
+        <w:t xml:space="preserve">** — </w:t>
       </w:r>
       <w:r>
         <w:rPr>
           <w:rFonts w:ascii="Consolas" w:cs="Consolas" w:eastAsia="Consolas" w:hAnsi="Consolas"/>
           <w:shd w:fill="F3F5F8" w:val="clear"/>
         </w:rPr>
-        <w:t xml:space="preserve">, </w:t>
+        <w:t xml:space="preserve">%</w:t>
+      </w:r>
+      <w:r>
+        <w:t xml:space="preserve"> only works for the *host* part of </w:t>
       </w:r>
       <w:r>
         <w:rPr>
           <w:rFonts w:ascii="Consolas" w:cs="Consolas" w:eastAsia="Consolas" w:hAnsi="Consolas"/>
           <w:shd w:fill="F3F5F8" w:val="clear"/>
         </w:rPr>
-        <w:t xml:space="preserve"> </w:t>
-      </w:r>
-      <w:r>
-        <w:t xml:space="preserve">%</w:t>
+        <w:t xml:space="preserve">user@host</w:t>
+      </w:r>
+      <w:r>
+        <w:t xml:space="preserve">. A rule written with `</w:t>
       </w:r>
       <w:r>
         <w:rPr>
@@ -2297,54 +2296,64 @@
         <w:t xml:space="preserve"> </w:t>
       </w:r>
       <w:r>
+        <w:t xml:space="preserve">%</w:t>
+      </w:r>
+      <w:r>
         <w:rPr>
           <w:rFonts w:ascii="Consolas" w:cs="Consolas" w:eastAsia="Consolas" w:hAnsi="Consolas"/>
           <w:shd w:fill="F3F5F8" w:val="clear"/>
         </w:rPr>
-        <w:t xml:space="preserve">); </w:t>
-      </w:r>
-      <w:r>
-        <w:t xml:space="preserve">op_result='B'</w:t>
+        <w:t xml:space="preserve"> </w:t>
       </w:r>
       <w:r>
         <w:rPr>
           <w:rFonts w:ascii="Consolas" w:cs="Consolas" w:eastAsia="Consolas" w:hAnsi="Consolas"/>
           <w:shd w:fill="F3F5F8" w:val="clear"/>
         </w:rPr>
-        <w:t xml:space="preserve"> (both success+fail); </w:t>
-      </w:r>
-      <w:r>
-        <w:t xml:space="preserve">ops</w:t>
+        <w:t xml:space="preserve"> matches objects *literally named* "%", so **no user queries are ever audited** (only Cloud SQL's always-on audit-config events appear). </w:t>
+      </w:r>
+      <w:r>
+        <w:t xml:space="preserve">op_result='B'</w:t>
       </w:r>
       <w:r>
         <w:rPr>
           <w:rFonts w:ascii="Consolas" w:cs="Consolas" w:eastAsia="Consolas" w:hAnsi="Consolas"/>
           <w:shd w:fill="F3F5F8" w:val="clear"/>
         </w:rPr>
-        <w:t xml:space="preserve"> are **categories** (</w:t>
-      </w:r>
-      <w:r>
-        <w:t xml:space="preserve">connect,dql,dml,ddl,dcl</w:t>
+        <w:t xml:space="preserve"> = success+fail; </w:t>
+      </w:r>
+      <w:r>
+        <w:t xml:space="preserve">ops='*'</w:t>
       </w:r>
       <w:r>
         <w:rPr>
           <w:rFonts w:ascii="Consolas" w:cs="Consolas" w:eastAsia="Consolas" w:hAnsi="Consolas"/>
           <w:shd w:fill="F3F5F8" w:val="clear"/>
         </w:rPr>
-        <w:t xml:space="preserve">), not </w:t>
-      </w:r>
-      <w:r>
-        <w:t xml:space="preserve">all</w:t>
+        <w:t xml:space="preserve"> = all operations. Verify (dbname/object must show </w:t>
+      </w:r>
+      <w:r>
+        <w:t xml:space="preserve">*</w:t>
       </w:r>
       <w:r>
         <w:rPr>
           <w:rFonts w:ascii="Consolas" w:cs="Consolas" w:eastAsia="Consolas" w:hAnsi="Consolas"/>
           <w:shd w:fill="F3F5F8" w:val="clear"/>
         </w:rPr>
-        <w:t xml:space="preserve">. Verify: </w:t>
-      </w:r>
-      <w:r>
-        <w:t xml:space="preserve">SELECT * FROM mysql.audit_log_rules;`</w:t>
+        <w:t xml:space="preserve">): </w:t>
+      </w:r>
+      <w:r>
+        <w:t xml:space="preserve">SELECT * FROM mysql.audit_log_rules;</w:t>
+      </w:r>
+      <w:r>
+        <w:rPr>
+          <w:rFonts w:ascii="Consolas" w:cs="Consolas" w:eastAsia="Consolas" w:hAnsi="Consolas"/>
+          <w:shd w:fill="F3F5F8" w:val="clear"/>
+        </w:rPr>
+        <w:t xml:space="preserve">  ·  Delete a rule by id: </w:t>
+      </w:r>
+      <w:r>
+        <w:t xml:space="preserve">CALL mysql.cloudsql_delete_audit_rule('5',1,@rc,@msg);`</w:t>
       </w:r>
     </w:p>
     <w:p>
@@ -4193,16 +4202,16 @@
                 <w:rFonts w:ascii="Consolas" w:cs="Consolas" w:eastAsia="Consolas" w:hAnsi="Consolas"/>
                 <w:shd w:fill="F3F5F8" w:val="clear"/>
               </w:rPr>
-              <w:t xml:space="preserve">expected 8, got 6</w:t>
-            </w:r>
-            <w:r>
-              <w:rPr>
-                <w:b w:val="false"/>
-                <w:bCs w:val="false"/>
-                <w:sz w:val="18"/>
-                <w:szCs w:val="18"/>
-              </w:rPr>
-              <w:t xml:space="preserve"> / </w:t>
+              <w:t xml:space="preserve">op_result should be 'S'/'U'/'B'/'E'</w:t>
+            </w:r>
+            <w:r>
+              <w:rPr>
+                <w:b w:val="false"/>
+                <w:bCs w:val="false"/>
+                <w:sz w:val="18"/>
+                <w:szCs w:val="18"/>
+              </w:rPr>
+              <w:t xml:space="preserve"> / bad </w:t>
             </w:r>
             <w:r>
               <w:rPr>
@@ -4213,16 +4222,64 @@
                 <w:rFonts w:ascii="Consolas" w:cs="Consolas" w:eastAsia="Consolas" w:hAnsi="Consolas"/>
                 <w:shd w:fill="F3F5F8" w:val="clear"/>
               </w:rPr>
-              <w:t xml:space="preserve">op_result should be 'S'/'U'/'B'/'E'</w:t>
-            </w:r>
-            <w:r>
-              <w:rPr>
-                <w:b w:val="false"/>
-                <w:bCs w:val="false"/>
-                <w:sz w:val="18"/>
-                <w:szCs w:val="18"/>
-              </w:rPr>
-              <w:t xml:space="preserve"> / </w:t>
+              <w:t xml:space="preserve">create_audit_rule</w:t>
+            </w:r>
+            <w:r>
+              <w:rPr>
+                <w:b w:val="false"/>
+                <w:bCs w:val="false"/>
+                <w:sz w:val="18"/>
+                <w:szCs w:val="18"/>
+              </w:rPr>
+              <w:t xml:space="preserve"> args</w:t>
+            </w:r>
+          </w:p>
+        </w:tc>
+        <w:tc>
+          <w:tcPr>
+            <w:tcMar>
+              <w:top w:type="dxa" w:w="40"/>
+              <w:left w:type="dxa" w:w="90"/>
+              <w:bottom w:type="dxa" w:w="40"/>
+              <w:right w:type="dxa" w:w="90"/>
+            </w:tcMar>
+          </w:tcPr>
+          <w:p>
+            <w:pPr>
+              <w:spacing w:after="0"/>
+            </w:pPr>
+            <w:r>
+              <w:rPr>
+                <w:b w:val="false"/>
+                <w:bCs w:val="false"/>
+                <w:sz w:val="18"/>
+                <w:szCs w:val="18"/>
+              </w:rPr>
+              <w:t xml:space="preserve">Wrong args</w:t>
+            </w:r>
+          </w:p>
+        </w:tc>
+        <w:tc>
+          <w:tcPr>
+            <w:tcMar>
+              <w:top w:type="dxa" w:w="40"/>
+              <w:left w:type="dxa" w:w="90"/>
+              <w:bottom w:type="dxa" w:w="40"/>
+              <w:right w:type="dxa" w:w="90"/>
+            </w:tcMar>
+          </w:tcPr>
+          <w:p>
+            <w:pPr>
+              <w:spacing w:after="0"/>
+            </w:pPr>
+            <w:r>
+              <w:rPr>
+                <w:b w:val="false"/>
+                <w:bCs w:val="false"/>
+                <w:sz w:val="18"/>
+                <w:szCs w:val="18"/>
+              </w:rPr>
+              <w:t xml:space="preserve">8 args; </w:t>
             </w:r>
             <w:r>
               <w:rPr>
@@ -4233,16 +4290,16 @@
                 <w:rFonts w:ascii="Consolas" w:cs="Consolas" w:eastAsia="Consolas" w:hAnsi="Consolas"/>
                 <w:shd w:fill="F3F5F8" w:val="clear"/>
               </w:rPr>
-              <w:t xml:space="preserve">Special characters only between backticks</w:t>
-            </w:r>
-            <w:r>
-              <w:rPr>
-                <w:b w:val="false"/>
-                <w:bCs w:val="false"/>
-                <w:sz w:val="18"/>
-                <w:szCs w:val="18"/>
-              </w:rPr>
-              <w:t xml:space="preserve"> / </w:t>
+              <w:t xml:space="preserve">op_result='B'</w:t>
+            </w:r>
+            <w:r>
+              <w:rPr>
+                <w:b w:val="false"/>
+                <w:bCs w:val="false"/>
+                <w:sz w:val="18"/>
+                <w:szCs w:val="18"/>
+              </w:rPr>
+              <w:t xml:space="preserve">; ops=</w:t>
             </w:r>
             <w:r>
               <w:rPr>
@@ -4253,31 +4310,16 @@
                 <w:rFonts w:ascii="Consolas" w:cs="Consolas" w:eastAsia="Consolas" w:hAnsi="Consolas"/>
                 <w:shd w:fill="F3F5F8" w:val="clear"/>
               </w:rPr>
-              <w:t xml:space="preserve">operation "all" not supported</w:t>
-            </w:r>
-          </w:p>
-        </w:tc>
-        <w:tc>
-          <w:tcPr>
-            <w:tcMar>
-              <w:top w:type="dxa" w:w="40"/>
-              <w:left w:type="dxa" w:w="90"/>
-              <w:bottom w:type="dxa" w:w="40"/>
-              <w:right w:type="dxa" w:w="90"/>
-            </w:tcMar>
-          </w:tcPr>
-          <w:p>
-            <w:pPr>
-              <w:spacing w:after="0"/>
-            </w:pPr>
-            <w:r>
-              <w:rPr>
-                <w:b w:val="false"/>
-                <w:bCs w:val="false"/>
-                <w:sz w:val="18"/>
-                <w:szCs w:val="18"/>
-              </w:rPr>
-              <w:t xml:space="preserve">Wrong </w:t>
+              <w:t xml:space="preserve">*</w:t>
+            </w:r>
+            <w:r>
+              <w:rPr>
+                <w:b w:val="false"/>
+                <w:bCs w:val="false"/>
+                <w:sz w:val="18"/>
+                <w:szCs w:val="18"/>
+              </w:rPr>
+              <w:t xml:space="preserve">; </w:t>
             </w:r>
             <w:r>
               <w:rPr>
@@ -4288,71 +4330,16 @@
                 <w:rFonts w:ascii="Consolas" w:cs="Consolas" w:eastAsia="Consolas" w:hAnsi="Consolas"/>
                 <w:shd w:fill="F3F5F8" w:val="clear"/>
               </w:rPr>
-              <w:t xml:space="preserve">create_audit_rule</w:t>
-            </w:r>
-            <w:r>
-              <w:rPr>
-                <w:b w:val="false"/>
-                <w:bCs w:val="false"/>
-                <w:sz w:val="18"/>
-                <w:szCs w:val="18"/>
-              </w:rPr>
-              <w:t xml:space="preserve"> args</w:t>
-            </w:r>
-          </w:p>
-        </w:tc>
-        <w:tc>
-          <w:tcPr>
-            <w:tcMar>
-              <w:top w:type="dxa" w:w="40"/>
-              <w:left w:type="dxa" w:w="90"/>
-              <w:bottom w:type="dxa" w:w="40"/>
-              <w:right w:type="dxa" w:w="90"/>
-            </w:tcMar>
-          </w:tcPr>
-          <w:p>
-            <w:pPr>
-              <w:spacing w:after="0"/>
-            </w:pPr>
-            <w:r>
-              <w:rPr>
-                <w:b w:val="false"/>
-                <w:bCs w:val="false"/>
-                <w:sz w:val="18"/>
-                <w:szCs w:val="18"/>
-              </w:rPr>
-              <w:t xml:space="preserve">8 args; </w:t>
-            </w:r>
-            <w:r>
-              <w:rPr>
-                <w:b w:val="false"/>
-                <w:bCs w:val="false"/>
-                <w:sz w:val="18"/>
-                <w:szCs w:val="18"/>
-                <w:rFonts w:ascii="Consolas" w:cs="Consolas" w:eastAsia="Consolas" w:hAnsi="Consolas"/>
-                <w:shd w:fill="F3F5F8" w:val="clear"/>
-              </w:rPr>
-              <w:t xml:space="preserve">op_result='B'</w:t>
-            </w:r>
-            <w:r>
-              <w:rPr>
-                <w:b w:val="false"/>
-                <w:bCs w:val="false"/>
-                <w:sz w:val="18"/>
-                <w:szCs w:val="18"/>
-              </w:rPr>
-              <w:t xml:space="preserve">; backtick wildcards; ops = </w:t>
-            </w:r>
-            <w:r>
-              <w:rPr>
-                <w:b w:val="false"/>
-                <w:bCs w:val="false"/>
-                <w:sz w:val="18"/>
-                <w:szCs w:val="18"/>
-                <w:rFonts w:ascii="Consolas" w:cs="Consolas" w:eastAsia="Consolas" w:hAnsi="Consolas"/>
-                <w:shd w:fill="F3F5F8" w:val="clear"/>
-              </w:rPr>
-              <w:t xml:space="preserve">connect,dql,dml,ddl,dcl</w:t>
+              <w:t xml:space="preserve">reload_mode</w:t>
+            </w:r>
+            <w:r>
+              <w:rPr>
+                <w:b w:val="false"/>
+                <w:bCs w:val="false"/>
+                <w:sz w:val="18"/>
+                <w:szCs w:val="18"/>
+              </w:rPr>
+              <w:t xml:space="preserve">=1</w:t>
             </w:r>
           </w:p>
         </w:tc>
@@ -4463,6 +4450,269 @@
                 <w:sz w:val="18"/>
                 <w:szCs w:val="18"/>
               </w:rPr>
+              <w:t xml:space="preserve">**Only </w:t>
+            </w:r>
+            <w:r>
+              <w:rPr>
+                <w:b w:val="false"/>
+                <w:bCs w:val="false"/>
+                <w:sz w:val="18"/>
+                <w:szCs w:val="18"/>
+                <w:rFonts w:ascii="Consolas" w:cs="Consolas" w:eastAsia="Consolas" w:hAnsi="Consolas"/>
+                <w:shd w:fill="F3F5F8" w:val="clear"/>
+              </w:rPr>
+              <w:t xml:space="preserve">mysql</w:t>
+            </w:r>
+            <w:r>
+              <w:rPr>
+                <w:b w:val="false"/>
+                <w:bCs w:val="false"/>
+                <w:sz w:val="18"/>
+                <w:szCs w:val="18"/>
+              </w:rPr>
+              <w:t xml:space="preserve">-schema / audit-config ops audited; NO user-table events (</w:t>
+            </w:r>
+            <w:r>
+              <w:rPr>
+                <w:b w:val="false"/>
+                <w:bCs w:val="false"/>
+                <w:sz w:val="18"/>
+                <w:szCs w:val="18"/>
+                <w:rFonts w:ascii="Consolas" w:cs="Consolas" w:eastAsia="Consolas" w:hAnsi="Consolas"/>
+                <w:shd w:fill="F3F5F8" w:val="clear"/>
+              </w:rPr>
+              <w:t xml:space="preserve">billing.*</w:t>
+            </w:r>
+            <w:r>
+              <w:rPr>
+                <w:b w:val="false"/>
+                <w:bCs w:val="false"/>
+                <w:sz w:val="18"/>
+                <w:szCs w:val="18"/>
+              </w:rPr>
+              <w:t xml:space="preserve"> etc.)**</w:t>
+            </w:r>
+          </w:p>
+        </w:tc>
+        <w:tc>
+          <w:tcPr>
+            <w:tcMar>
+              <w:top w:type="dxa" w:w="40"/>
+              <w:left w:type="dxa" w:w="90"/>
+              <w:bottom w:type="dxa" w:w="40"/>
+              <w:right w:type="dxa" w:w="90"/>
+            </w:tcMar>
+          </w:tcPr>
+          <w:p>
+            <w:pPr>
+              <w:spacing w:after="0"/>
+            </w:pPr>
+            <w:r>
+              <w:rPr>
+                <w:b w:val="false"/>
+                <w:bCs w:val="false"/>
+                <w:sz w:val="18"/>
+                <w:szCs w:val="18"/>
+              </w:rPr>
+              <w:t xml:space="preserve">Wrong wildcard in the rule</w:t>
+            </w:r>
+            <w:r>
+              <w:rPr>
+                <w:b w:val="false"/>
+                <w:bCs w:val="false"/>
+                <w:sz w:val="18"/>
+                <w:szCs w:val="18"/>
+              </w:rPr>
+              <w:t xml:space="preserve"> — used </w:t>
+            </w:r>
+            <w:r>
+              <w:rPr>
+                <w:b w:val="false"/>
+                <w:bCs w:val="false"/>
+                <w:sz w:val="18"/>
+                <w:szCs w:val="18"/>
+                <w:rFonts w:ascii="Consolas" w:cs="Consolas" w:eastAsia="Consolas" w:hAnsi="Consolas"/>
+                <w:shd w:fill="F3F5F8" w:val="clear"/>
+              </w:rPr>
+              <w:t xml:space="preserve">%</w:t>
+            </w:r>
+            <w:r>
+              <w:rPr>
+                <w:b w:val="false"/>
+                <w:bCs w:val="false"/>
+                <w:sz w:val="18"/>
+                <w:szCs w:val="18"/>
+              </w:rPr>
+              <w:t xml:space="preserve"> instead of </w:t>
+            </w:r>
+            <w:r>
+              <w:rPr>
+                <w:b w:val="false"/>
+                <w:bCs w:val="false"/>
+                <w:sz w:val="18"/>
+                <w:szCs w:val="18"/>
+                <w:rFonts w:ascii="Consolas" w:cs="Consolas" w:eastAsia="Consolas" w:hAnsi="Consolas"/>
+                <w:shd w:fill="F3F5F8" w:val="clear"/>
+              </w:rPr>
+              <w:t xml:space="preserve">*</w:t>
+            </w:r>
+            <w:r>
+              <w:rPr>
+                <w:b w:val="false"/>
+                <w:bCs w:val="false"/>
+                <w:sz w:val="18"/>
+                <w:szCs w:val="18"/>
+              </w:rPr>
+              <w:t xml:space="preserve">; </w:t>
+            </w:r>
+            <w:r>
+              <w:rPr>
+                <w:b w:val="false"/>
+                <w:bCs w:val="false"/>
+                <w:sz w:val="18"/>
+                <w:szCs w:val="18"/>
+                <w:rFonts w:ascii="Consolas" w:cs="Consolas" w:eastAsia="Consolas" w:hAnsi="Consolas"/>
+                <w:shd w:fill="F3F5F8" w:val="clear"/>
+              </w:rPr>
+              <w:t xml:space="preserve">%</w:t>
+            </w:r>
+            <w:r>
+              <w:rPr>
+                <w:b w:val="false"/>
+                <w:bCs w:val="false"/>
+                <w:sz w:val="18"/>
+                <w:szCs w:val="18"/>
+              </w:rPr>
+              <w:t xml:space="preserve"> matches nothing for db/object</w:t>
+            </w:r>
+          </w:p>
+        </w:tc>
+        <w:tc>
+          <w:tcPr>
+            <w:tcMar>
+              <w:top w:type="dxa" w:w="40"/>
+              <w:left w:type="dxa" w:w="90"/>
+              <w:bottom w:type="dxa" w:w="40"/>
+              <w:right w:type="dxa" w:w="90"/>
+            </w:tcMar>
+          </w:tcPr>
+          <w:p>
+            <w:pPr>
+              <w:spacing w:after="0"/>
+            </w:pPr>
+            <w:r>
+              <w:rPr>
+                <w:b w:val="false"/>
+                <w:bCs w:val="false"/>
+                <w:sz w:val="18"/>
+                <w:szCs w:val="18"/>
+              </w:rPr>
+              <w:t xml:space="preserve">Recreate the rule with </w:t>
+            </w:r>
+            <w:r>
+              <w:rPr>
+                <w:b w:val="false"/>
+                <w:bCs w:val="false"/>
+                <w:sz w:val="18"/>
+                <w:szCs w:val="18"/>
+                <w:rFonts w:ascii="Consolas" w:cs="Consolas" w:eastAsia="Consolas" w:hAnsi="Consolas"/>
+                <w:shd w:fill="F3F5F8" w:val="clear"/>
+              </w:rPr>
+              <w:t xml:space="preserve">*</w:t>
+            </w:r>
+            <w:r>
+              <w:rPr>
+                <w:b w:val="false"/>
+                <w:bCs w:val="false"/>
+                <w:sz w:val="18"/>
+                <w:szCs w:val="18"/>
+              </w:rPr>
+              <w:t xml:space="preserve">: </w:t>
+            </w:r>
+            <w:r>
+              <w:rPr>
+                <w:b w:val="false"/>
+                <w:bCs w:val="false"/>
+                <w:sz w:val="18"/>
+                <w:szCs w:val="18"/>
+                <w:rFonts w:ascii="Consolas" w:cs="Consolas" w:eastAsia="Consolas" w:hAnsi="Consolas"/>
+                <w:shd w:fill="F3F5F8" w:val="clear"/>
+              </w:rPr>
+              <w:t xml:space="preserve">CALL mysql.cloudsql_create_audit_rule('*','*','*','*','B',1,@rc,@msg);</w:t>
+            </w:r>
+            <w:r>
+              <w:rPr>
+                <w:b w:val="false"/>
+                <w:bCs w:val="false"/>
+                <w:sz w:val="18"/>
+                <w:szCs w:val="18"/>
+              </w:rPr>
+              <w:t xml:space="preserve"> then </w:t>
+            </w:r>
+            <w:r>
+              <w:rPr>
+                <w:b w:val="false"/>
+                <w:bCs w:val="false"/>
+                <w:sz w:val="18"/>
+                <w:szCs w:val="18"/>
+                <w:rFonts w:ascii="Consolas" w:cs="Consolas" w:eastAsia="Consolas" w:hAnsi="Consolas"/>
+                <w:shd w:fill="F3F5F8" w:val="clear"/>
+              </w:rPr>
+              <w:t xml:space="preserve">cloudsql_reload_audit_rule(1)</w:t>
+            </w:r>
+            <w:r>
+              <w:rPr>
+                <w:b w:val="false"/>
+                <w:bCs w:val="false"/>
+                <w:sz w:val="18"/>
+                <w:szCs w:val="18"/>
+              </w:rPr>
+              <w:t xml:space="preserve">. (The </w:t>
+            </w:r>
+            <w:r>
+              <w:rPr>
+                <w:b w:val="false"/>
+                <w:bCs w:val="false"/>
+                <w:sz w:val="18"/>
+                <w:szCs w:val="18"/>
+                <w:rFonts w:ascii="Consolas" w:cs="Consolas" w:eastAsia="Consolas" w:hAnsi="Consolas"/>
+                <w:shd w:fill="F3F5F8" w:val="clear"/>
+              </w:rPr>
+              <w:t xml:space="preserve">mysql</w:t>
+            </w:r>
+            <w:r>
+              <w:rPr>
+                <w:b w:val="false"/>
+                <w:bCs w:val="false"/>
+                <w:sz w:val="18"/>
+                <w:szCs w:val="18"/>
+              </w:rPr>
+              <w:t xml:space="preserve">-schema entries you see are Cloud SQL's always-on audit-config logging, not your rule.)</w:t>
+            </w:r>
+          </w:p>
+        </w:tc>
+      </w:tr>
+      <w:tr>
+        <w:tc>
+          <w:tcPr>
+            <w:tcMar>
+              <w:top w:type="dxa" w:w="40"/>
+              <w:left w:type="dxa" w:w="90"/>
+              <w:bottom w:type="dxa" w:w="40"/>
+              <w:right w:type="dxa" w:w="90"/>
+            </w:tcMar>
+          </w:tcPr>
+          <w:p>
+            <w:pPr>
+              <w:spacing w:after="0"/>
+            </w:pPr>
+            <w:r>
+              <w:rPr>
+                <w:b w:val="false"/>
+                <w:bCs w:val="false"/>
+                <w:sz w:val="18"/>
+                <w:szCs w:val="18"/>
+              </w:rPr>
               <w:t xml:space="preserve">System queries flow, but user-table queries don't</w:t>
             </w:r>
           </w:p>
@@ -4558,7 +4808,112 @@
                 <w:sz w:val="18"/>
                 <w:szCs w:val="18"/>
               </w:rPr>
-              <w:t xml:space="preserve">; wait for propagation (~10 min)</w:t>
+              <w:t xml:space="preserve">; wait for propagation (~10 min); restart instance if still stalled</w:t>
+            </w:r>
+          </w:p>
+        </w:tc>
+      </w:tr>
+      <w:tr>
+        <w:tc>
+          <w:tcPr>
+            <w:tcMar>
+              <w:top w:type="dxa" w:w="40"/>
+              <w:left w:type="dxa" w:w="90"/>
+              <w:bottom w:type="dxa" w:w="40"/>
+              <w:right w:type="dxa" w:w="90"/>
+            </w:tcMar>
+          </w:tcPr>
+          <w:p>
+            <w:pPr>
+              <w:spacing w:after="0"/>
+            </w:pPr>
+            <w:r>
+              <w:rPr>
+                <w:b w:val="false"/>
+                <w:bCs w:val="false"/>
+                <w:sz w:val="18"/>
+                <w:szCs w:val="18"/>
+              </w:rPr>
+              <w:t xml:space="preserve">Audit Trail flooded with `root` heartbeat / `@@version` / `performance_schema` noise</w:t>
+            </w:r>
+          </w:p>
+        </w:tc>
+        <w:tc>
+          <w:tcPr>
+            <w:tcMar>
+              <w:top w:type="dxa" w:w="40"/>
+              <w:left w:type="dxa" w:w="90"/>
+              <w:bottom w:type="dxa" w:w="40"/>
+              <w:right w:type="dxa" w:w="90"/>
+            </w:tcMar>
+          </w:tcPr>
+          <w:p>
+            <w:pPr>
+              <w:spacing w:after="0"/>
+            </w:pPr>
+            <w:r>
+              <w:rPr>
+                <w:b w:val="false"/>
+                <w:bCs w:val="false"/>
+                <w:sz w:val="18"/>
+                <w:szCs w:val="18"/>
+                <w:rFonts w:ascii="Consolas" w:cs="Consolas" w:eastAsia="Consolas" w:hAnsi="Consolas"/>
+                <w:shd w:fill="F3F5F8" w:val="clear"/>
+              </w:rPr>
+              <w:t xml:space="preserve">*</w:t>
+            </w:r>
+            <w:r>
+              <w:rPr>
+                <w:b w:val="false"/>
+                <w:bCs w:val="false"/>
+                <w:sz w:val="18"/>
+                <w:szCs w:val="18"/>
+              </w:rPr>
+              <w:t xml:space="preserve"> rule audits Cloud SQL internal traffic too</w:t>
+            </w:r>
+          </w:p>
+        </w:tc>
+        <w:tc>
+          <w:tcPr>
+            <w:tcMar>
+              <w:top w:type="dxa" w:w="40"/>
+              <w:left w:type="dxa" w:w="90"/>
+              <w:bottom w:type="dxa" w:w="40"/>
+              <w:right w:type="dxa" w:w="90"/>
+            </w:tcMar>
+          </w:tcPr>
+          <w:p>
+            <w:pPr>
+              <w:spacing w:after="0"/>
+            </w:pPr>
+            <w:r>
+              <w:rPr>
+                <w:b w:val="false"/>
+                <w:bCs w:val="false"/>
+                <w:sz w:val="18"/>
+                <w:szCs w:val="18"/>
+              </w:rPr>
+              <w:t xml:space="preserve">Scope the rule's db to user DBs (e.g. </w:t>
+            </w:r>
+            <w:r>
+              <w:rPr>
+                <w:b w:val="false"/>
+                <w:bCs w:val="false"/>
+                <w:sz w:val="18"/>
+                <w:szCs w:val="18"/>
+                <w:rFonts w:ascii="Consolas" w:cs="Consolas" w:eastAsia="Consolas" w:hAnsi="Consolas"/>
+                <w:shd w:fill="F3F5F8" w:val="clear"/>
+              </w:rPr>
+              <w:t xml:space="preserve">'billing'</w:t>
+            </w:r>
+            <w:r>
+              <w:rPr>
+                <w:b w:val="false"/>
+                <w:bCs w:val="false"/>
+                <w:sz w:val="18"/>
+                <w:szCs w:val="18"/>
+              </w:rPr>
+              <w:t xml:space="preserve">), and/or filter system-user/system-schema events on ingest</w:t>
             </w:r>
           </w:p>
         </w:tc>

</xml_diff>